<commit_message>
chore(sync): update 44 file(s) [.gitignore, CHANGELOG.md, CITATION.cff, data, docs, methodology, outputs, README.md, reviews, scripts, skills]
Automated settle-aware sync of the knowledge base.

Co-Authored-By: Claude Opus 4.8 <noreply@anthropic.com>
</commit_message>
<xml_diff>
--- a/outputs/Barotrauma_state_of_the_art_overview.docx
+++ b/outputs/Barotrauma_state_of_the_art_overview.docx
@@ -56,7 +56,7 @@
         <w:rPr>
           <w:i/>
         </w:rPr>
-        <w:t xml:space="preserve">A state-of-the-art assessment of 61 barotrauma papers (38 live-fish</w:t>
+        <w:t xml:space="preserve">A state-of-the-art assessment of 66 barotrauma papers (39 live-fish</w:t>
       </w:r>
       <w:r>
         <w:rPr>
@@ -181,7 +181,7 @@
         <w:pStyle w:val="BodyText"/>
       </w:pPr>
       <w:r>
-        <w:t xml:space="preserve">Scope. We screened all 228 papers in the passage library for barotrauma</w:t>
+        <w:t xml:space="preserve">Scope. We screened all 255 papers in the passage library for barotrauma</w:t>
       </w:r>
       <w:r>
         <w:t xml:space="preserve"> </w:t>
@@ -199,13 +199,13 @@
         <w:t xml:space="preserve"> </w:t>
       </w:r>
       <w:r>
-        <w:t xml:space="preserve">retained 61 barotrauma-relevant papers. Of these, 38 are live-fish</w:t>
-      </w:r>
-      <w:r>
-        <w:t xml:space="preserve"> </w:t>
-      </w:r>
-      <w:r>
-        <w:t xml:space="preserve">studies — 31 controlled laboratory (pressure-chamber /</w:t>
+        <w:t xml:space="preserve">retained 66 barotrauma-relevant papers. Of these, 39 are live-fish</w:t>
+      </w:r>
+      <w:r>
+        <w:t xml:space="preserve"> </w:t>
+      </w:r>
+      <w:r>
+        <w:t xml:space="preserve">studies — 32 controlled laboratory (pressure-chamber /</w:t>
       </w:r>
       <w:r>
         <w:t xml:space="preserve"> </w:t>
@@ -217,7 +217,7 @@
         <w:t xml:space="preserve"> </w:t>
       </w:r>
       <w:r>
-        <w:t xml:space="preserve">these 38 form the reproducibility assessment. The remaining 23</w:t>
+        <w:t xml:space="preserve">these 39 form the reproducibility assessment. The remaining 27</w:t>
       </w:r>
       <w:r>
         <w:t xml:space="preserve"> </w:t>
@@ -337,7 +337,7 @@
               <w:jc w:val="left"/>
             </w:pPr>
             <w:r>
-              <w:t xml:space="preserve">31</w:t>
+              <w:t xml:space="preserve">32</w:t>
             </w:r>
           </w:p>
         </w:tc>
@@ -1233,7 +1233,7 @@
         <w:pStyle w:val="FirstParagraph"/>
       </w:pPr>
       <w:r>
-        <w:t xml:space="preserve">Method. Each of the 38 live-fish studies was scored against a 10-element</w:t>
+        <w:t xml:space="preserve">Method. Each of the 39 live-fish studies was scored against a 10-element</w:t>
       </w:r>
       <w:r>
         <w:t xml:space="preserve"> </w:t>
@@ -1433,7 +1433,7 @@
               <w:jc w:val="left"/>
             </w:pPr>
             <w:r>
-              <w:t xml:space="preserve">90%</w:t>
+              <w:t xml:space="preserve">91%</w:t>
             </w:r>
           </w:p>
         </w:tc>
@@ -1503,7 +1503,7 @@
               <w:jc w:val="left"/>
             </w:pPr>
             <w:r>
-              <w:t xml:space="preserve">84%</w:t>
+              <w:t xml:space="preserve">82%</w:t>
             </w:r>
           </w:p>
         </w:tc>
@@ -1608,7 +1608,7 @@
               <w:jc w:val="left"/>
             </w:pPr>
             <w:r>
-              <w:t xml:space="preserve">68%</w:t>
+              <w:t xml:space="preserve">67%</w:t>
             </w:r>
           </w:p>
         </w:tc>
@@ -1643,7 +1643,7 @@
               <w:jc w:val="left"/>
             </w:pPr>
             <w:r>
-              <w:t xml:space="preserve">63%</w:t>
+              <w:t xml:space="preserve">64%</w:t>
             </w:r>
           </w:p>
         </w:tc>
@@ -1678,7 +1678,7 @@
               <w:jc w:val="left"/>
             </w:pPr>
             <w:r>
-              <w:t xml:space="preserve">42%</w:t>
+              <w:t xml:space="preserve">41%</w:t>
             </w:r>
           </w:p>
         </w:tc>
@@ -1713,7 +1713,7 @@
               <w:jc w:val="left"/>
             </w:pPr>
             <w:r>
-              <w:t xml:space="preserve">39%</w:t>
+              <w:t xml:space="preserve">41%</w:t>
             </w:r>
           </w:p>
         </w:tc>
@@ -2642,7 +2642,7 @@
         <w:rPr>
           <w:i/>
         </w:rPr>
-        <w:t xml:space="preserve">Method note: the 61-paper set and per-criterion scores were generated</w:t>
+        <w:t xml:space="preserve">Method note: the 66-paper set and per-criterion scores were generated</w:t>
       </w:r>
       <w:r>
         <w:rPr>

</xml_diff>